<commit_message>
Update project report Word docx with live web app and GitHub repository links
</commit_message>
<xml_diff>
--- a/outputs/FitLife_Wellness_Analytics_Project_Report.docx
+++ b/outputs/FitLife_Wellness_Analytics_Project_Report.docx
@@ -30,6 +30,31 @@
         <w:t>Smart-Device Biometric Telemetry, Consumer Behavior &amp; Strategic Business Analytics</w:t>
       </w:r>
     </w:p>
+    <w:p>
+      <w:pPr>
+        <w:pStyle w:val="Heading2"/>
+      </w:pPr>
+      <w:r>
+        <w:t>🌐 Live Project Links &amp; Repository References</w:t>
+      </w:r>
+    </w:p>
+    <w:p>
+      <w:r>
+        <w:rPr>
+          <w:sz w:val="22"/>
+        </w:rPr>
+        <w:t>• Live Streamlit Web Application: https://pravatsahu05-stravafitnessanalytics.streamlit.app</w:t>
+      </w:r>
+    </w:p>
+    <w:p>
+      <w:r>
+        <w:rPr>
+          <w:sz w:val="22"/>
+        </w:rPr>
+        <w:t>• GitHub Source Code Repository: https://github.com/pravatsahu05/Strava_Fitness_Analytics</w:t>
+      </w:r>
+    </w:p>
+    <w:p/>
     <w:p>
       <w:pPr>
         <w:jc w:val="center"/>

</xml_diff>